<commit_message>
REPORTS-25: Mark partial custom files and fix the smaller review findings
Custom Word templates get {{partial}} and {{partialBanner}}, listed in the
tag reference and used by the example template. Excel properties carry
the issue count. A self-closing Relationships part no longer loses
images. A field without a name no longer stops every export. The tag
parser lives apart from the renderer so no build warns about the
ineffective dynamic import. JSDoc, the R19 read count and the PDF run
count are corrected; rulings R25-R29 are recorded.

Co-Authored-By: Claude Opus 5.5 (1M context) <noreply@anthropic.com>
</commit_message>
<xml_diff>
--- a/apps/reports/static/app/public/example-template.docx
+++ b/apps/reports/static/app/public/example-template.docx
@@ -9,6 +9,25 @@
       </w:pPr>
       <w:r>
         <w:t xml:space="preserve">{{title}}</w:t>
+      </w:r>
+    </w:p>
+    <w:p>
+      <w:r>
+        <w:t xml:space="preserve">{{#partial}}</w:t>
+      </w:r>
+    </w:p>
+    <w:p>
+      <w:r>
+        <w:rPr>
+          <w:b/>
+          <w:bCs/>
+        </w:rPr>
+        <w:t xml:space="preserve">{{partialBanner}}</w:t>
+      </w:r>
+    </w:p>
+    <w:p>
+      <w:r>
+        <w:t xml:space="preserve">{{/partial}}</w:t>
       </w:r>
     </w:p>
     <w:p>

</xml_diff>